<commit_message>
feat: complete executive operations dashboard and sql benchmark lab
</commit_message>
<xml_diff>
--- a/Table_Details.docx
+++ b/Table_Details.docx
@@ -32,6 +32,7 @@
         <w:t xml:space="preserve">1. </w:t>
       </w:r>
       <w:proofErr w:type="spellStart"/>
+      <w:proofErr w:type="gramStart"/>
       <w:r>
         <w:rPr>
           <w:b/>
@@ -40,6 +41,7 @@
         <w:t>aviation.airports</w:t>
       </w:r>
       <w:proofErr w:type="spellEnd"/>
+      <w:proofErr w:type="gramEnd"/>
     </w:p>
     <w:p>
       <w:pPr>
@@ -152,6 +154,7 @@
         <w:t xml:space="preserve">2. </w:t>
       </w:r>
       <w:proofErr w:type="spellStart"/>
+      <w:proofErr w:type="gramStart"/>
       <w:r>
         <w:rPr>
           <w:b/>
@@ -160,6 +163,7 @@
         <w:t>aviation.airlines</w:t>
       </w:r>
       <w:proofErr w:type="spellEnd"/>
+      <w:proofErr w:type="gramEnd"/>
     </w:p>
     <w:p>
       <w:pPr>
@@ -272,6 +276,7 @@
         <w:t xml:space="preserve">3. </w:t>
       </w:r>
       <w:proofErr w:type="spellStart"/>
+      <w:proofErr w:type="gramStart"/>
       <w:r>
         <w:rPr>
           <w:b/>
@@ -280,6 +285,7 @@
         <w:t>aviation.routes</w:t>
       </w:r>
       <w:proofErr w:type="spellEnd"/>
+      <w:proofErr w:type="gramEnd"/>
     </w:p>
     <w:p>
       <w:pPr>
@@ -407,6 +413,7 @@
         <w:t xml:space="preserve">4. </w:t>
       </w:r>
       <w:proofErr w:type="spellStart"/>
+      <w:proofErr w:type="gramStart"/>
       <w:r>
         <w:rPr>
           <w:b/>
@@ -415,6 +422,7 @@
         <w:t>aviation.flights</w:t>
       </w:r>
       <w:proofErr w:type="spellEnd"/>
+      <w:proofErr w:type="gramEnd"/>
     </w:p>
     <w:p>
       <w:pPr>
@@ -657,6 +665,7 @@
         <w:t xml:space="preserve">5. </w:t>
       </w:r>
       <w:proofErr w:type="spellStart"/>
+      <w:proofErr w:type="gramStart"/>
       <w:r>
         <w:rPr>
           <w:b/>
@@ -665,6 +674,7 @@
         <w:t>aviation.weather</w:t>
       </w:r>
       <w:proofErr w:type="spellEnd"/>
+      <w:proofErr w:type="gramEnd"/>
     </w:p>
     <w:p>
       <w:pPr>
@@ -817,6 +827,7 @@
         <w:t xml:space="preserve">6. </w:t>
       </w:r>
       <w:proofErr w:type="spellStart"/>
+      <w:proofErr w:type="gramStart"/>
       <w:r>
         <w:rPr>
           <w:b/>
@@ -825,6 +836,7 @@
         <w:t>aviation.passengers</w:t>
       </w:r>
       <w:proofErr w:type="spellEnd"/>
+      <w:proofErr w:type="gramEnd"/>
     </w:p>
     <w:p>
       <w:pPr>
@@ -937,12 +949,21 @@
         <w:t xml:space="preserve">7. </w:t>
       </w:r>
       <w:proofErr w:type="spellStart"/>
-      <w:r>
-        <w:rPr>
-          <w:b/>
-          <w:bCs/>
-        </w:rPr>
-        <w:t>aviation.maintenance_logs</w:t>
+      <w:proofErr w:type="gramStart"/>
+      <w:r>
+        <w:rPr>
+          <w:b/>
+          <w:bCs/>
+        </w:rPr>
+        <w:t>aviation.maintenance</w:t>
+      </w:r>
+      <w:proofErr w:type="gramEnd"/>
+      <w:r>
+        <w:rPr>
+          <w:b/>
+          <w:bCs/>
+        </w:rPr>
+        <w:t>_logs</w:t>
       </w:r>
       <w:proofErr w:type="spellEnd"/>
     </w:p>
@@ -1006,6 +1027,7 @@
         <w:t xml:space="preserve"> Live Flights Table (</w:t>
       </w:r>
       <w:proofErr w:type="spellStart"/>
+      <w:proofErr w:type="gramStart"/>
       <w:r>
         <w:rPr>
           <w:b/>
@@ -1014,6 +1036,7 @@
         <w:t>aviation.flights</w:t>
       </w:r>
       <w:proofErr w:type="spellEnd"/>
+      <w:proofErr w:type="gramEnd"/>
       <w:r>
         <w:rPr>
           <w:b/>
@@ -1114,10 +1137,12 @@
         <w:t xml:space="preserve"> values from </w:t>
       </w:r>
       <w:proofErr w:type="spellStart"/>
+      <w:proofErr w:type="gramStart"/>
       <w:r>
         <w:t>aviation.flights</w:t>
       </w:r>
       <w:proofErr w:type="spellEnd"/>
+      <w:proofErr w:type="gramEnd"/>
       <w:r>
         <w:t>.</w:t>
       </w:r>
@@ -1134,13 +1159,18 @@
       </w:r>
       <w:proofErr w:type="spellStart"/>
       <w:r>
-        <w:t>schiphol_flight_ids</w:t>
+        <w:t>schiphol_flight_</w:t>
+      </w:r>
+      <w:proofErr w:type="gramStart"/>
+      <w:r>
+        <w:t>ids</w:t>
       </w:r>
       <w:proofErr w:type="spellEnd"/>
       <w:r>
         <w:t>[</w:t>
       </w:r>
       <w:proofErr w:type="spellStart"/>
+      <w:proofErr w:type="gramEnd"/>
       <w:r>
         <w:t>i</w:t>
       </w:r>
@@ -1191,6 +1221,7 @@
         <w:t xml:space="preserve">8. </w:t>
       </w:r>
       <w:proofErr w:type="spellStart"/>
+      <w:proofErr w:type="gramStart"/>
       <w:r>
         <w:rPr>
           <w:b/>
@@ -1199,6 +1230,7 @@
         <w:t>aviation.retail</w:t>
       </w:r>
       <w:proofErr w:type="spellEnd"/>
+      <w:proofErr w:type="gramEnd"/>
     </w:p>
     <w:p>
       <w:pPr>
@@ -1261,6 +1293,7 @@
         <w:t xml:space="preserve"> Live Flights Table (</w:t>
       </w:r>
       <w:proofErr w:type="spellStart"/>
+      <w:proofErr w:type="gramStart"/>
       <w:r>
         <w:rPr>
           <w:b/>
@@ -1269,6 +1302,7 @@
         <w:t>aviation.flights</w:t>
       </w:r>
       <w:proofErr w:type="spellEnd"/>
+      <w:proofErr w:type="gramEnd"/>
       <w:r>
         <w:rPr>
           <w:b/>
@@ -1398,6 +1432,7 @@
         <w:t xml:space="preserve">9. </w:t>
       </w:r>
       <w:proofErr w:type="spellStart"/>
+      <w:proofErr w:type="gramStart"/>
       <w:r>
         <w:rPr>
           <w:b/>
@@ -1406,6 +1441,7 @@
         <w:t>aviation.baggage</w:t>
       </w:r>
       <w:proofErr w:type="spellEnd"/>
+      <w:proofErr w:type="gramEnd"/>
     </w:p>
     <w:p>
       <w:pPr>
@@ -1467,6 +1503,7 @@
         <w:t xml:space="preserve"> Live Flights Table (</w:t>
       </w:r>
       <w:proofErr w:type="spellStart"/>
+      <w:proofErr w:type="gramStart"/>
       <w:r>
         <w:rPr>
           <w:b/>
@@ -1475,6 +1512,7 @@
         <w:t>aviation.flights</w:t>
       </w:r>
       <w:proofErr w:type="spellEnd"/>
+      <w:proofErr w:type="gramEnd"/>
       <w:r>
         <w:rPr>
           <w:b/>
@@ -1603,6 +1641,7 @@
         <w:t xml:space="preserve">10. </w:t>
       </w:r>
       <w:proofErr w:type="spellStart"/>
+      <w:proofErr w:type="gramStart"/>
       <w:r>
         <w:rPr>
           <w:b/>
@@ -1611,6 +1650,7 @@
         <w:t>aviation.parking</w:t>
       </w:r>
       <w:proofErr w:type="spellEnd"/>
+      <w:proofErr w:type="gramEnd"/>
     </w:p>
     <w:p>
       <w:pPr>
@@ -1707,10 +1747,12 @@
         <w:t xml:space="preserve"> Queried </w:t>
       </w:r>
       <w:proofErr w:type="spellStart"/>
+      <w:proofErr w:type="gramStart"/>
       <w:r>
         <w:t>aviation.passengers</w:t>
       </w:r>
       <w:proofErr w:type="spellEnd"/>
+      <w:proofErr w:type="gramEnd"/>
       <w:r>
         <w:t xml:space="preserve"> and sampled ~40% of passengers to simulate </w:t>
       </w:r>
@@ -3167,6 +3209,8 @@
         <w:t xml:space="preserve"> </w:t>
       </w:r>
     </w:p>
+    <w:p/>
+    <w:p/>
     <w:sectPr>
       <w:type w:val="continuous"/>
       <w:pgSz w:w="11930" w:h="16870" w:code="9"/>

</xml_diff>